<commit_message>
Add Snapdragon X Elite CPU vs NPU benchmark on the same device; remove dev-machine details from docs and screenshots
</commit_message>
<xml_diff>
--- a/submission/NotesNPU_Description.docx
+++ b/submission/NotesNPU_Description.docx
@@ -892,7 +892,7 @@
                 <w:b w:val="0"/>
                 <w:sz w:val="19"/>
               </w:rPr>
-              <w:t>Intel i5-7200U laptop (dev machine), CPU</w:t>
+              <w:t>Snapdragon X Elite, Oryon CPU (measured on Qualcomm AI Hub)</w:t>
             </w:r>
           </w:p>
         </w:tc>
@@ -906,7 +906,7 @@
                 <w:b w:val="0"/>
                 <w:sz w:val="19"/>
               </w:rPr>
-              <w:t>5.7x real time (14.9 s)</w:t>
+              <w:t>~14x real time (~6.1 s)</w:t>
             </w:r>
           </w:p>
         </w:tc>
@@ -920,7 +920,7 @@
                 <w:b w:val="0"/>
                 <w:sz w:val="19"/>
               </w:rPr>
-              <w:t>1312 ms</w:t>
+              <w:t>1286 ms</w:t>
             </w:r>
           </w:p>
         </w:tc>
@@ -934,7 +934,7 @@
                 <w:b w:val="0"/>
                 <w:sz w:val="19"/>
               </w:rPr>
-              <w:t>44.8 ms</w:t>
+              <w:t>9.1 ms</w:t>
             </w:r>
           </w:p>
         </w:tc>
@@ -950,7 +950,7 @@
                 <w:b w:val="0"/>
                 <w:sz w:val="19"/>
               </w:rPr>
-              <w:t>Snapdragon X Elite NPU (measured on Qualcomm AI Hub)</w:t>
+              <w:t>Snapdragon X Elite, Hexagon NPU (measured on Qualcomm AI Hub)</w:t>
             </w:r>
           </w:p>
         </w:tc>
@@ -1022,7 +1022,7 @@
                 <w:b w:val="0"/>
                 <w:sz w:val="19"/>
               </w:rPr>
-              <w:t>~14x end to end</w:t>
+              <w:t>~5.7x end to end</w:t>
             </w:r>
           </w:p>
         </w:tc>
@@ -1036,7 +1036,7 @@
                 <w:b w:val="0"/>
                 <w:sz w:val="19"/>
               </w:rPr>
-              <w:t>28.8x</w:t>
+              <w:t>28.3x</w:t>
             </w:r>
           </w:p>
         </w:tc>
@@ -1050,7 +1050,7 @@
                 <w:b w:val="0"/>
                 <w:sz w:val="19"/>
               </w:rPr>
-              <w:t>11.8x</w:t>
+              <w:t>2.4x</w:t>
             </w:r>
           </w:p>
         </w:tc>
@@ -1086,7 +1086,7 @@
         <w:pStyle w:val="ListBullet"/>
       </w:pPr>
       <w:r>
-        <w:t>The 85 s sample lecture takes ~1.1 s on the NPU vs 14.9 s on a laptop CPU.</w:t>
+        <w:t>The 85 s sample lecture takes ~1.1 s on the NPU vs ~6.1 s on the same Snapdragon X Elite's Oryon CPU.</w:t>
       </w:r>
     </w:p>
     <w:p>
@@ -1430,7 +1430,7 @@
       <w:r>
         <w:drawing>
           <wp:inline xmlns:a="http://schemas.openxmlformats.org/drawingml/2006/main" xmlns:pic="http://schemas.openxmlformats.org/drawingml/2006/picture">
-            <wp:extent cx="3840480" cy="3944918"/>
+            <wp:extent cx="3840480" cy="3717053"/>
             <wp:docPr id="1" name="Picture 1"/>
             <wp:cNvGraphicFramePr>
               <a:graphicFrameLocks noChangeAspect="1"/>
@@ -1451,7 +1451,7 @@
                   <pic:spPr>
                     <a:xfrm>
                       <a:off x="0" y="0"/>
-                      <a:ext cx="3840480" cy="3944918"/>
+                      <a:ext cx="3840480" cy="3717053"/>
                     </a:xfrm>
                     <a:prstGeom prst="rect"/>
                   </pic:spPr>

</xml_diff>